<commit_message>
Implement code changes to enhance functionality and improve performance
</commit_message>
<xml_diff>
--- a/report.docx
+++ b/report.docx
@@ -612,7 +612,7 @@
       <w:pPr>
         <w:pStyle w:val="Heading1"/>
       </w:pPr>
-      <w:bookmarkStart w:id="0" w:name="_Toc197129208"/>
+      <w:bookmarkStart w:id="0" w:name="_Toc197129315"/>
       <w:r>
         <w:t>Project Overview</w:t>
       </w:r>
@@ -686,7 +686,7 @@
           <w:r>
             <w:fldChar w:fldCharType="separate"/>
           </w:r>
-          <w:hyperlink w:anchor="_Toc197129208" w:history="1">
+          <w:hyperlink w:anchor="_Toc197129315" w:history="1">
             <w:r>
               <w:rPr>
                 <w:rStyle w:val="Hyperlink"/>
@@ -713,7 +713,7 @@
                 <w:noProof/>
                 <w:webHidden/>
               </w:rPr>
-              <w:instrText xml:space="preserve"> PAGEREF _Toc197129208 \h </w:instrText>
+              <w:instrText xml:space="preserve"> PAGEREF _Toc197129315 \h </w:instrText>
             </w:r>
             <w:r>
               <w:rPr>
@@ -757,7 +757,7 @@
               <w:szCs w:val="24"/>
             </w:rPr>
           </w:pPr>
-          <w:hyperlink w:anchor="_Toc197129209" w:history="1">
+          <w:hyperlink w:anchor="_Toc197129316" w:history="1">
             <w:r>
               <w:rPr>
                 <w:rStyle w:val="Hyperlink"/>
@@ -784,7 +784,7 @@
                 <w:noProof/>
                 <w:webHidden/>
               </w:rPr>
-              <w:instrText xml:space="preserve"> PAGEREF _Toc197129209 \h </w:instrText>
+              <w:instrText xml:space="preserve"> PAGEREF _Toc197129316 \h </w:instrText>
             </w:r>
             <w:r>
               <w:rPr>
@@ -828,7 +828,7 @@
               <w:szCs w:val="24"/>
             </w:rPr>
           </w:pPr>
-          <w:hyperlink w:anchor="_Toc197129210" w:history="1">
+          <w:hyperlink w:anchor="_Toc197129317" w:history="1">
             <w:r>
               <w:rPr>
                 <w:rStyle w:val="Hyperlink"/>
@@ -855,7 +855,7 @@
                 <w:noProof/>
                 <w:webHidden/>
               </w:rPr>
-              <w:instrText xml:space="preserve"> PAGEREF _Toc197129210 \h </w:instrText>
+              <w:instrText xml:space="preserve"> PAGEREF _Toc197129317 \h </w:instrText>
             </w:r>
             <w:r>
               <w:rPr>
@@ -899,7 +899,7 @@
               <w:szCs w:val="24"/>
             </w:rPr>
           </w:pPr>
-          <w:hyperlink w:anchor="_Toc197129211" w:history="1">
+          <w:hyperlink w:anchor="_Toc197129318" w:history="1">
             <w:r>
               <w:rPr>
                 <w:rStyle w:val="Hyperlink"/>
@@ -926,7 +926,7 @@
                 <w:noProof/>
                 <w:webHidden/>
               </w:rPr>
-              <w:instrText xml:space="preserve"> PAGEREF _Toc197129211 \h </w:instrText>
+              <w:instrText xml:space="preserve"> PAGEREF _Toc197129318 \h </w:instrText>
             </w:r>
             <w:r>
               <w:rPr>
@@ -970,7 +970,7 @@
               <w:szCs w:val="24"/>
             </w:rPr>
           </w:pPr>
-          <w:hyperlink w:anchor="_Toc197129212" w:history="1">
+          <w:hyperlink w:anchor="_Toc197129319" w:history="1">
             <w:r>
               <w:rPr>
                 <w:rStyle w:val="Hyperlink"/>
@@ -997,7 +997,7 @@
                 <w:noProof/>
                 <w:webHidden/>
               </w:rPr>
-              <w:instrText xml:space="preserve"> PAGEREF _Toc197129212 \h </w:instrText>
+              <w:instrText xml:space="preserve"> PAGEREF _Toc197129319 \h </w:instrText>
             </w:r>
             <w:r>
               <w:rPr>
@@ -1041,7 +1041,7 @@
               <w:szCs w:val="24"/>
             </w:rPr>
           </w:pPr>
-          <w:hyperlink w:anchor="_Toc197129213" w:history="1">
+          <w:hyperlink w:anchor="_Toc197129320" w:history="1">
             <w:r>
               <w:rPr>
                 <w:rStyle w:val="Hyperlink"/>
@@ -1068,7 +1068,7 @@
                 <w:noProof/>
                 <w:webHidden/>
               </w:rPr>
-              <w:instrText xml:space="preserve"> PAGEREF _Toc197129213 \h </w:instrText>
+              <w:instrText xml:space="preserve"> PAGEREF _Toc197129320 \h </w:instrText>
             </w:r>
             <w:r>
               <w:rPr>
@@ -1112,7 +1112,7 @@
               <w:szCs w:val="24"/>
             </w:rPr>
           </w:pPr>
-          <w:hyperlink w:anchor="_Toc197129214" w:history="1">
+          <w:hyperlink w:anchor="_Toc197129321" w:history="1">
             <w:r>
               <w:rPr>
                 <w:rStyle w:val="Hyperlink"/>
@@ -1139,7 +1139,7 @@
                 <w:noProof/>
                 <w:webHidden/>
               </w:rPr>
-              <w:instrText xml:space="preserve"> PAGEREF _Toc197129214 \h </w:instrText>
+              <w:instrText xml:space="preserve"> PAGEREF _Toc197129321 \h </w:instrText>
             </w:r>
             <w:r>
               <w:rPr>
@@ -1183,7 +1183,7 @@
               <w:szCs w:val="24"/>
             </w:rPr>
           </w:pPr>
-          <w:hyperlink w:anchor="_Toc197129215" w:history="1">
+          <w:hyperlink w:anchor="_Toc197129322" w:history="1">
             <w:r>
               <w:rPr>
                 <w:rStyle w:val="Hyperlink"/>
@@ -1210,7 +1210,7 @@
                 <w:noProof/>
                 <w:webHidden/>
               </w:rPr>
-              <w:instrText xml:space="preserve"> PAGEREF _Toc197129215 \h </w:instrText>
+              <w:instrText xml:space="preserve"> PAGEREF _Toc197129322 \h </w:instrText>
             </w:r>
             <w:r>
               <w:rPr>
@@ -1254,7 +1254,7 @@
               <w:szCs w:val="24"/>
             </w:rPr>
           </w:pPr>
-          <w:hyperlink w:anchor="_Toc197129216" w:history="1">
+          <w:hyperlink w:anchor="_Toc197129323" w:history="1">
             <w:r>
               <w:rPr>
                 <w:rStyle w:val="Hyperlink"/>
@@ -1281,7 +1281,7 @@
                 <w:noProof/>
                 <w:webHidden/>
               </w:rPr>
-              <w:instrText xml:space="preserve"> PAGEREF _Toc197129216 \h </w:instrText>
+              <w:instrText xml:space="preserve"> PAGEREF _Toc197129323 \h </w:instrText>
             </w:r>
             <w:r>
               <w:rPr>
@@ -1325,7 +1325,7 @@
               <w:szCs w:val="24"/>
             </w:rPr>
           </w:pPr>
-          <w:hyperlink w:anchor="_Toc197129217" w:history="1">
+          <w:hyperlink w:anchor="_Toc197129324" w:history="1">
             <w:r>
               <w:rPr>
                 <w:rStyle w:val="Hyperlink"/>
@@ -1352,7 +1352,7 @@
                 <w:noProof/>
                 <w:webHidden/>
               </w:rPr>
-              <w:instrText xml:space="preserve"> PAGEREF _Toc197129217 \h </w:instrText>
+              <w:instrText xml:space="preserve"> PAGEREF _Toc197129324 \h </w:instrText>
             </w:r>
             <w:r>
               <w:rPr>
@@ -1396,7 +1396,7 @@
               <w:szCs w:val="24"/>
             </w:rPr>
           </w:pPr>
-          <w:hyperlink w:anchor="_Toc197129218" w:history="1">
+          <w:hyperlink w:anchor="_Toc197129325" w:history="1">
             <w:r>
               <w:rPr>
                 <w:rStyle w:val="Hyperlink"/>
@@ -1423,7 +1423,7 @@
                 <w:noProof/>
                 <w:webHidden/>
               </w:rPr>
-              <w:instrText xml:space="preserve"> PAGEREF _Toc197129218 \h </w:instrText>
+              <w:instrText xml:space="preserve"> PAGEREF _Toc197129325 \h </w:instrText>
             </w:r>
             <w:r>
               <w:rPr>
@@ -1467,7 +1467,7 @@
               <w:szCs w:val="24"/>
             </w:rPr>
           </w:pPr>
-          <w:hyperlink w:anchor="_Toc197129219" w:history="1">
+          <w:hyperlink w:anchor="_Toc197129326" w:history="1">
             <w:r>
               <w:rPr>
                 <w:rStyle w:val="Hyperlink"/>
@@ -1494,7 +1494,78 @@
                 <w:noProof/>
                 <w:webHidden/>
               </w:rPr>
-              <w:instrText xml:space="preserve"> PAGEREF _Toc197129219 \h </w:instrText>
+              <w:instrText xml:space="preserve"> PAGEREF _Toc197129326 \h </w:instrText>
+            </w:r>
+            <w:r>
+              <w:rPr>
+                <w:noProof/>
+                <w:webHidden/>
+              </w:rPr>
+            </w:r>
+            <w:r>
+              <w:rPr>
+                <w:noProof/>
+                <w:webHidden/>
+              </w:rPr>
+              <w:fldChar w:fldCharType="separate"/>
+            </w:r>
+            <w:r>
+              <w:rPr>
+                <w:noProof/>
+                <w:webHidden/>
+              </w:rPr>
+              <w:t>7</w:t>
+            </w:r>
+            <w:r>
+              <w:rPr>
+                <w:noProof/>
+                <w:webHidden/>
+              </w:rPr>
+              <w:fldChar w:fldCharType="end"/>
+            </w:r>
+          </w:hyperlink>
+        </w:p>
+        <w:p>
+          <w:pPr>
+            <w:pStyle w:val="TOC1"/>
+            <w:tabs>
+              <w:tab w:val="right" w:leader="dot" w:pos="9350"/>
+            </w:tabs>
+            <w:rPr>
+              <w:rFonts w:eastAsiaTheme="minorEastAsia"/>
+              <w:noProof/>
+              <w:sz w:val="24"/>
+              <w:szCs w:val="24"/>
+            </w:rPr>
+          </w:pPr>
+          <w:hyperlink w:anchor="_Toc197129327" w:history="1">
+            <w:r>
+              <w:rPr>
+                <w:rStyle w:val="Hyperlink"/>
+                <w:noProof/>
+              </w:rPr>
+              <w:t>Seed Encryption – AES-CBC</w:t>
+            </w:r>
+            <w:r>
+              <w:rPr>
+                <w:noProof/>
+                <w:webHidden/>
+              </w:rPr>
+              <w:tab/>
+            </w:r>
+            <w:r>
+              <w:rPr>
+                <w:noProof/>
+                <w:webHidden/>
+              </w:rPr>
+              <w:fldChar w:fldCharType="begin"/>
+            </w:r>
+            <w:r>
+              <w:rPr>
+                <w:noProof/>
+                <w:webHidden/>
+              </w:rPr>
+              <w:instrText xml:space="preserve"> PAGEREF _Toc197129327 \h </w:instrText>
             </w:r>
             <w:r>
               <w:rPr>
@@ -1538,13 +1609,13 @@
               <w:szCs w:val="24"/>
             </w:rPr>
           </w:pPr>
-          <w:hyperlink w:anchor="_Toc197129220" w:history="1">
+          <w:hyperlink w:anchor="_Toc197129328" w:history="1">
             <w:r>
               <w:rPr>
                 <w:rStyle w:val="Hyperlink"/>
                 <w:noProof/>
               </w:rPr>
-              <w:t>Seed Encryption – AES-CBC</w:t>
+              <w:t>Purpose</w:t>
             </w:r>
             <w:r>
               <w:rPr>
@@ -1565,7 +1636,7 @@
                 <w:noProof/>
                 <w:webHidden/>
               </w:rPr>
-              <w:instrText xml:space="preserve"> PAGEREF _Toc197129220 \h </w:instrText>
+              <w:instrText xml:space="preserve"> PAGEREF _Toc197129328 \h </w:instrText>
             </w:r>
             <w:r>
               <w:rPr>
@@ -1609,13 +1680,13 @@
               <w:szCs w:val="24"/>
             </w:rPr>
           </w:pPr>
-          <w:hyperlink w:anchor="_Toc197129221" w:history="1">
+          <w:hyperlink w:anchor="_Toc197129329" w:history="1">
             <w:r>
               <w:rPr>
                 <w:rStyle w:val="Hyperlink"/>
                 <w:noProof/>
               </w:rPr>
-              <w:t>Purpose</w:t>
+              <w:t>Key Components</w:t>
             </w:r>
             <w:r>
               <w:rPr>
@@ -1636,7 +1707,7 @@
                 <w:noProof/>
                 <w:webHidden/>
               </w:rPr>
-              <w:instrText xml:space="preserve"> PAGEREF _Toc197129221 \h </w:instrText>
+              <w:instrText xml:space="preserve"> PAGEREF _Toc197129329 \h </w:instrText>
             </w:r>
             <w:r>
               <w:rPr>
@@ -1680,13 +1751,13 @@
               <w:szCs w:val="24"/>
             </w:rPr>
           </w:pPr>
-          <w:hyperlink w:anchor="_Toc197129222" w:history="1">
+          <w:hyperlink w:anchor="_Toc197129330" w:history="1">
             <w:r>
               <w:rPr>
                 <w:rStyle w:val="Hyperlink"/>
                 <w:noProof/>
               </w:rPr>
-              <w:t>Key Components</w:t>
+              <w:t>Algorithm Details :</w:t>
             </w:r>
             <w:r>
               <w:rPr>
@@ -1707,7 +1778,7 @@
                 <w:noProof/>
                 <w:webHidden/>
               </w:rPr>
-              <w:instrText xml:space="preserve"> PAGEREF _Toc197129222 \h </w:instrText>
+              <w:instrText xml:space="preserve"> PAGEREF _Toc197129330 \h </w:instrText>
             </w:r>
             <w:r>
               <w:rPr>
@@ -1751,13 +1822,28 @@
               <w:szCs w:val="24"/>
             </w:rPr>
           </w:pPr>
-          <w:hyperlink w:anchor="_Toc197129223" w:history="1">
+          <w:hyperlink w:anchor="_Toc197129331" w:history="1">
             <w:r>
               <w:rPr>
                 <w:rStyle w:val="Hyperlink"/>
                 <w:noProof/>
               </w:rPr>
-              <w:t>Algorithm Details :</w:t>
+              <w:t>Implementation</w:t>
+            </w:r>
+            <w:r>
+              <w:rPr>
+                <w:rStyle w:val="Hyperlink"/>
+                <w:noProof/>
+                <w:rtl/>
+              </w:rPr>
+              <w:t xml:space="preserve"> </w:t>
+            </w:r>
+            <w:r>
+              <w:rPr>
+                <w:rStyle w:val="Hyperlink"/>
+                <w:noProof/>
+              </w:rPr>
+              <w:t>with a test case:</w:t>
             </w:r>
             <w:r>
               <w:rPr>
@@ -1778,7 +1864,7 @@
                 <w:noProof/>
                 <w:webHidden/>
               </w:rPr>
-              <w:instrText xml:space="preserve"> PAGEREF _Toc197129223 \h </w:instrText>
+              <w:instrText xml:space="preserve"> PAGEREF _Toc197129331 \h </w:instrText>
             </w:r>
             <w:r>
               <w:rPr>
@@ -1798,7 +1884,7 @@
                 <w:noProof/>
                 <w:webHidden/>
               </w:rPr>
-              <w:t>7</w:t>
+              <w:t>8</w:t>
             </w:r>
             <w:r>
               <w:rPr>
@@ -1822,28 +1908,84 @@
               <w:szCs w:val="24"/>
             </w:rPr>
           </w:pPr>
-          <w:hyperlink w:anchor="_Toc197129224" w:history="1">
+          <w:hyperlink w:anchor="_Toc197129332" w:history="1">
             <w:r>
               <w:rPr>
                 <w:rStyle w:val="Hyperlink"/>
                 <w:noProof/>
               </w:rPr>
-              <w:t>Implementation</w:t>
-            </w:r>
+              <w:t>Test Case output:</w:t>
+            </w:r>
+            <w:r>
+              <w:rPr>
+                <w:noProof/>
+                <w:webHidden/>
+              </w:rPr>
+              <w:tab/>
+            </w:r>
+            <w:r>
+              <w:rPr>
+                <w:noProof/>
+                <w:webHidden/>
+              </w:rPr>
+              <w:fldChar w:fldCharType="begin"/>
+            </w:r>
+            <w:r>
+              <w:rPr>
+                <w:noProof/>
+                <w:webHidden/>
+              </w:rPr>
+              <w:instrText xml:space="preserve"> PAGEREF _Toc197129332 \h </w:instrText>
+            </w:r>
+            <w:r>
+              <w:rPr>
+                <w:noProof/>
+                <w:webHidden/>
+              </w:rPr>
+            </w:r>
+            <w:r>
+              <w:rPr>
+                <w:noProof/>
+                <w:webHidden/>
+              </w:rPr>
+              <w:fldChar w:fldCharType="separate"/>
+            </w:r>
+            <w:r>
+              <w:rPr>
+                <w:noProof/>
+                <w:webHidden/>
+              </w:rPr>
+              <w:t>9</w:t>
+            </w:r>
+            <w:r>
+              <w:rPr>
+                <w:noProof/>
+                <w:webHidden/>
+              </w:rPr>
+              <w:fldChar w:fldCharType="end"/>
+            </w:r>
+          </w:hyperlink>
+        </w:p>
+        <w:p>
+          <w:pPr>
+            <w:pStyle w:val="TOC1"/>
+            <w:tabs>
+              <w:tab w:val="right" w:leader="dot" w:pos="9350"/>
+            </w:tabs>
+            <w:rPr>
+              <w:rFonts w:eastAsiaTheme="minorEastAsia"/>
+              <w:noProof/>
+              <w:sz w:val="24"/>
+              <w:szCs w:val="24"/>
+            </w:rPr>
+          </w:pPr>
+          <w:hyperlink w:anchor="_Toc197129333" w:history="1">
             <w:r>
               <w:rPr>
                 <w:rStyle w:val="Hyperlink"/>
                 <w:noProof/>
-                <w:rtl/>
-              </w:rPr>
-              <w:t xml:space="preserve"> </w:t>
-            </w:r>
-            <w:r>
-              <w:rPr>
-                <w:rStyle w:val="Hyperlink"/>
-                <w:noProof/>
-              </w:rPr>
-              <w:t>with a test case:</w:t>
+              </w:rPr>
+              <w:t>Seed Authentication</w:t>
             </w:r>
             <w:r>
               <w:rPr>
@@ -1864,7 +2006,7 @@
                 <w:noProof/>
                 <w:webHidden/>
               </w:rPr>
-              <w:instrText xml:space="preserve"> PAGEREF _Toc197129224 \h </w:instrText>
+              <w:instrText xml:space="preserve"> PAGEREF _Toc197129333 \h </w:instrText>
             </w:r>
             <w:r>
               <w:rPr>
@@ -1884,7 +2026,7 @@
                 <w:noProof/>
                 <w:webHidden/>
               </w:rPr>
-              <w:t>8</w:t>
+              <w:t>9</w:t>
             </w:r>
             <w:r>
               <w:rPr>
@@ -1908,12 +2050,311 @@
               <w:szCs w:val="24"/>
             </w:rPr>
           </w:pPr>
-          <w:hyperlink w:anchor="_Toc197129225" w:history="1">
+          <w:hyperlink w:anchor="_Toc197129334" w:history="1">
             <w:r>
               <w:rPr>
                 <w:rStyle w:val="Hyperlink"/>
                 <w:noProof/>
               </w:rPr>
+              <w:t>Purpose</w:t>
+            </w:r>
+            <w:r>
+              <w:rPr>
+                <w:noProof/>
+                <w:webHidden/>
+              </w:rPr>
+              <w:tab/>
+            </w:r>
+            <w:r>
+              <w:rPr>
+                <w:noProof/>
+                <w:webHidden/>
+              </w:rPr>
+              <w:fldChar w:fldCharType="begin"/>
+            </w:r>
+            <w:r>
+              <w:rPr>
+                <w:noProof/>
+                <w:webHidden/>
+              </w:rPr>
+              <w:instrText xml:space="preserve"> PAGEREF _Toc197129334 \h </w:instrText>
+            </w:r>
+            <w:r>
+              <w:rPr>
+                <w:noProof/>
+                <w:webHidden/>
+              </w:rPr>
+            </w:r>
+            <w:r>
+              <w:rPr>
+                <w:noProof/>
+                <w:webHidden/>
+              </w:rPr>
+              <w:fldChar w:fldCharType="separate"/>
+            </w:r>
+            <w:r>
+              <w:rPr>
+                <w:noProof/>
+                <w:webHidden/>
+              </w:rPr>
+              <w:t>9</w:t>
+            </w:r>
+            <w:r>
+              <w:rPr>
+                <w:noProof/>
+                <w:webHidden/>
+              </w:rPr>
+              <w:fldChar w:fldCharType="end"/>
+            </w:r>
+          </w:hyperlink>
+        </w:p>
+        <w:p>
+          <w:pPr>
+            <w:pStyle w:val="TOC2"/>
+            <w:tabs>
+              <w:tab w:val="right" w:leader="dot" w:pos="9350"/>
+            </w:tabs>
+            <w:rPr>
+              <w:rFonts w:eastAsiaTheme="minorEastAsia"/>
+              <w:noProof/>
+              <w:sz w:val="24"/>
+              <w:szCs w:val="24"/>
+            </w:rPr>
+          </w:pPr>
+          <w:hyperlink w:anchor="_Toc197129335" w:history="1">
+            <w:r>
+              <w:rPr>
+                <w:rStyle w:val="Hyperlink"/>
+                <w:noProof/>
+              </w:rPr>
+              <w:t>Key Components :</w:t>
+            </w:r>
+            <w:r>
+              <w:rPr>
+                <w:noProof/>
+                <w:webHidden/>
+              </w:rPr>
+              <w:tab/>
+            </w:r>
+            <w:r>
+              <w:rPr>
+                <w:noProof/>
+                <w:webHidden/>
+              </w:rPr>
+              <w:fldChar w:fldCharType="begin"/>
+            </w:r>
+            <w:r>
+              <w:rPr>
+                <w:noProof/>
+                <w:webHidden/>
+              </w:rPr>
+              <w:instrText xml:space="preserve"> PAGEREF _Toc197129335 \h </w:instrText>
+            </w:r>
+            <w:r>
+              <w:rPr>
+                <w:noProof/>
+                <w:webHidden/>
+              </w:rPr>
+            </w:r>
+            <w:r>
+              <w:rPr>
+                <w:noProof/>
+                <w:webHidden/>
+              </w:rPr>
+              <w:fldChar w:fldCharType="separate"/>
+            </w:r>
+            <w:r>
+              <w:rPr>
+                <w:noProof/>
+                <w:webHidden/>
+              </w:rPr>
+              <w:t>9</w:t>
+            </w:r>
+            <w:r>
+              <w:rPr>
+                <w:noProof/>
+                <w:webHidden/>
+              </w:rPr>
+              <w:fldChar w:fldCharType="end"/>
+            </w:r>
+          </w:hyperlink>
+        </w:p>
+        <w:p>
+          <w:pPr>
+            <w:pStyle w:val="TOC2"/>
+            <w:tabs>
+              <w:tab w:val="right" w:leader="dot" w:pos="9350"/>
+            </w:tabs>
+            <w:rPr>
+              <w:rFonts w:eastAsiaTheme="minorEastAsia"/>
+              <w:noProof/>
+              <w:sz w:val="24"/>
+              <w:szCs w:val="24"/>
+            </w:rPr>
+          </w:pPr>
+          <w:hyperlink w:anchor="_Toc197129336" w:history="1">
+            <w:r>
+              <w:rPr>
+                <w:rStyle w:val="Hyperlink"/>
+                <w:noProof/>
+              </w:rPr>
+              <w:t>Algorithm Details :</w:t>
+            </w:r>
+            <w:r>
+              <w:rPr>
+                <w:noProof/>
+                <w:webHidden/>
+              </w:rPr>
+              <w:tab/>
+            </w:r>
+            <w:r>
+              <w:rPr>
+                <w:noProof/>
+                <w:webHidden/>
+              </w:rPr>
+              <w:fldChar w:fldCharType="begin"/>
+            </w:r>
+            <w:r>
+              <w:rPr>
+                <w:noProof/>
+                <w:webHidden/>
+              </w:rPr>
+              <w:instrText xml:space="preserve"> PAGEREF _Toc197129336 \h </w:instrText>
+            </w:r>
+            <w:r>
+              <w:rPr>
+                <w:noProof/>
+                <w:webHidden/>
+              </w:rPr>
+            </w:r>
+            <w:r>
+              <w:rPr>
+                <w:noProof/>
+                <w:webHidden/>
+              </w:rPr>
+              <w:fldChar w:fldCharType="separate"/>
+            </w:r>
+            <w:r>
+              <w:rPr>
+                <w:noProof/>
+                <w:webHidden/>
+              </w:rPr>
+              <w:t>9</w:t>
+            </w:r>
+            <w:r>
+              <w:rPr>
+                <w:noProof/>
+                <w:webHidden/>
+              </w:rPr>
+              <w:fldChar w:fldCharType="end"/>
+            </w:r>
+          </w:hyperlink>
+        </w:p>
+        <w:p>
+          <w:pPr>
+            <w:pStyle w:val="TOC2"/>
+            <w:tabs>
+              <w:tab w:val="right" w:leader="dot" w:pos="9350"/>
+            </w:tabs>
+            <w:rPr>
+              <w:rFonts w:eastAsiaTheme="minorEastAsia"/>
+              <w:noProof/>
+              <w:sz w:val="24"/>
+              <w:szCs w:val="24"/>
+            </w:rPr>
+          </w:pPr>
+          <w:hyperlink w:anchor="_Toc197129337" w:history="1">
+            <w:r>
+              <w:rPr>
+                <w:rStyle w:val="Hyperlink"/>
+                <w:noProof/>
+              </w:rPr>
+              <w:t>Implementation</w:t>
+            </w:r>
+            <w:r>
+              <w:rPr>
+                <w:rStyle w:val="Hyperlink"/>
+                <w:noProof/>
+                <w:rtl/>
+              </w:rPr>
+              <w:t xml:space="preserve"> </w:t>
+            </w:r>
+            <w:r>
+              <w:rPr>
+                <w:rStyle w:val="Hyperlink"/>
+                <w:noProof/>
+              </w:rPr>
+              <w:t>with a test case:</w:t>
+            </w:r>
+            <w:r>
+              <w:rPr>
+                <w:noProof/>
+                <w:webHidden/>
+              </w:rPr>
+              <w:tab/>
+            </w:r>
+            <w:r>
+              <w:rPr>
+                <w:noProof/>
+                <w:webHidden/>
+              </w:rPr>
+              <w:fldChar w:fldCharType="begin"/>
+            </w:r>
+            <w:r>
+              <w:rPr>
+                <w:noProof/>
+                <w:webHidden/>
+              </w:rPr>
+              <w:instrText xml:space="preserve"> PAGEREF _Toc197129337 \h </w:instrText>
+            </w:r>
+            <w:r>
+              <w:rPr>
+                <w:noProof/>
+                <w:webHidden/>
+              </w:rPr>
+            </w:r>
+            <w:r>
+              <w:rPr>
+                <w:noProof/>
+                <w:webHidden/>
+              </w:rPr>
+              <w:fldChar w:fldCharType="separate"/>
+            </w:r>
+            <w:r>
+              <w:rPr>
+                <w:noProof/>
+                <w:webHidden/>
+              </w:rPr>
+              <w:t>10</w:t>
+            </w:r>
+            <w:r>
+              <w:rPr>
+                <w:noProof/>
+                <w:webHidden/>
+              </w:rPr>
+              <w:fldChar w:fldCharType="end"/>
+            </w:r>
+          </w:hyperlink>
+        </w:p>
+        <w:p>
+          <w:pPr>
+            <w:pStyle w:val="TOC2"/>
+            <w:tabs>
+              <w:tab w:val="right" w:leader="dot" w:pos="9350"/>
+            </w:tabs>
+            <w:rPr>
+              <w:rFonts w:eastAsiaTheme="minorEastAsia"/>
+              <w:noProof/>
+              <w:sz w:val="24"/>
+              <w:szCs w:val="24"/>
+            </w:rPr>
+          </w:pPr>
+          <w:hyperlink w:anchor="_Toc197129338" w:history="1">
+            <w:r>
+              <w:rPr>
+                <w:rStyle w:val="Hyperlink"/>
+                <w:noProof/>
+              </w:rPr>
               <w:t>Test Case output:</w:t>
             </w:r>
             <w:r>
@@ -1935,7 +2376,7 @@
                 <w:noProof/>
                 <w:webHidden/>
               </w:rPr>
-              <w:instrText xml:space="preserve"> PAGEREF _Toc197129225 \h </w:instrText>
+              <w:instrText xml:space="preserve"> PAGEREF _Toc197129338 \h </w:instrText>
             </w:r>
             <w:r>
               <w:rPr>
@@ -1955,7 +2396,7 @@
                 <w:noProof/>
                 <w:webHidden/>
               </w:rPr>
-              <w:t>9</w:t>
+              <w:t>11</w:t>
             </w:r>
             <w:r>
               <w:rPr>
@@ -1979,13 +2420,13 @@
               <w:szCs w:val="24"/>
             </w:rPr>
           </w:pPr>
-          <w:hyperlink w:anchor="_Toc197129226" w:history="1">
+          <w:hyperlink w:anchor="_Toc197129339" w:history="1">
             <w:r>
               <w:rPr>
                 <w:rStyle w:val="Hyperlink"/>
                 <w:noProof/>
               </w:rPr>
-              <w:t>Seed Authentication</w:t>
+              <w:t>Linear Congruential Generator</w:t>
             </w:r>
             <w:r>
               <w:rPr>
@@ -2006,7 +2447,7 @@
                 <w:noProof/>
                 <w:webHidden/>
               </w:rPr>
-              <w:instrText xml:space="preserve"> PAGEREF _Toc197129226 \h </w:instrText>
+              <w:instrText xml:space="preserve"> PAGEREF _Toc197129339 \h </w:instrText>
             </w:r>
             <w:r>
               <w:rPr>
@@ -2026,7 +2467,7 @@
                 <w:noProof/>
                 <w:webHidden/>
               </w:rPr>
-              <w:t>9</w:t>
+              <w:t>11</w:t>
             </w:r>
             <w:r>
               <w:rPr>
@@ -2050,7 +2491,7 @@
               <w:szCs w:val="24"/>
             </w:rPr>
           </w:pPr>
-          <w:hyperlink w:anchor="_Toc197129227" w:history="1">
+          <w:hyperlink w:anchor="_Toc197129340" w:history="1">
             <w:r>
               <w:rPr>
                 <w:rStyle w:val="Hyperlink"/>
@@ -2077,7 +2518,7 @@
                 <w:noProof/>
                 <w:webHidden/>
               </w:rPr>
-              <w:instrText xml:space="preserve"> PAGEREF _Toc197129227 \h </w:instrText>
+              <w:instrText xml:space="preserve"> PAGEREF _Toc197129340 \h </w:instrText>
             </w:r>
             <w:r>
               <w:rPr>
@@ -2097,7 +2538,7 @@
                 <w:noProof/>
                 <w:webHidden/>
               </w:rPr>
-              <w:t>9</w:t>
+              <w:t>11</w:t>
             </w:r>
             <w:r>
               <w:rPr>
@@ -2121,7 +2562,7 @@
               <w:szCs w:val="24"/>
             </w:rPr>
           </w:pPr>
-          <w:hyperlink w:anchor="_Toc197129228" w:history="1">
+          <w:hyperlink w:anchor="_Toc197129341" w:history="1">
             <w:r>
               <w:rPr>
                 <w:rStyle w:val="Hyperlink"/>
@@ -2148,7 +2589,7 @@
                 <w:noProof/>
                 <w:webHidden/>
               </w:rPr>
-              <w:instrText xml:space="preserve"> PAGEREF _Toc197129228 \h </w:instrText>
+              <w:instrText xml:space="preserve"> PAGEREF _Toc197129341 \h </w:instrText>
             </w:r>
             <w:r>
               <w:rPr>
@@ -2168,7 +2609,7 @@
                 <w:noProof/>
                 <w:webHidden/>
               </w:rPr>
-              <w:t>9</w:t>
+              <w:t>11</w:t>
             </w:r>
             <w:r>
               <w:rPr>
@@ -2192,7 +2633,7 @@
               <w:szCs w:val="24"/>
             </w:rPr>
           </w:pPr>
-          <w:hyperlink w:anchor="_Toc197129229" w:history="1">
+          <w:hyperlink w:anchor="_Toc197129342" w:history="1">
             <w:r>
               <w:rPr>
                 <w:rStyle w:val="Hyperlink"/>
@@ -2219,7 +2660,7 @@
                 <w:noProof/>
                 <w:webHidden/>
               </w:rPr>
-              <w:instrText xml:space="preserve"> PAGEREF _Toc197129229 \h </w:instrText>
+              <w:instrText xml:space="preserve"> PAGEREF _Toc197129342 \h </w:instrText>
             </w:r>
             <w:r>
               <w:rPr>
@@ -2239,7 +2680,7 @@
                 <w:noProof/>
                 <w:webHidden/>
               </w:rPr>
-              <w:t>9</w:t>
+              <w:t>11</w:t>
             </w:r>
             <w:r>
               <w:rPr>
@@ -2263,28 +2704,13 @@
               <w:szCs w:val="24"/>
             </w:rPr>
           </w:pPr>
-          <w:hyperlink w:anchor="_Toc197129230" w:history="1">
+          <w:hyperlink w:anchor="_Toc197129343" w:history="1">
             <w:r>
               <w:rPr>
                 <w:rStyle w:val="Hyperlink"/>
                 <w:noProof/>
               </w:rPr>
-              <w:t>Implementation</w:t>
-            </w:r>
-            <w:r>
-              <w:rPr>
-                <w:rStyle w:val="Hyperlink"/>
-                <w:noProof/>
-                <w:rtl/>
-              </w:rPr>
-              <w:t xml:space="preserve"> </w:t>
-            </w:r>
-            <w:r>
-              <w:rPr>
-                <w:rStyle w:val="Hyperlink"/>
-                <w:noProof/>
-              </w:rPr>
-              <w:t>with a test case:</w:t>
+              <w:t>Design Choices:</w:t>
             </w:r>
             <w:r>
               <w:rPr>
@@ -2305,7 +2731,7 @@
                 <w:noProof/>
                 <w:webHidden/>
               </w:rPr>
-              <w:instrText xml:space="preserve"> PAGEREF _Toc197129230 \h </w:instrText>
+              <w:instrText xml:space="preserve"> PAGEREF _Toc197129343 \h </w:instrText>
             </w:r>
             <w:r>
               <w:rPr>
@@ -2325,7 +2751,7 @@
                 <w:noProof/>
                 <w:webHidden/>
               </w:rPr>
-              <w:t>10</w:t>
+              <w:t>11</w:t>
             </w:r>
             <w:r>
               <w:rPr>
@@ -2349,13 +2775,28 @@
               <w:szCs w:val="24"/>
             </w:rPr>
           </w:pPr>
-          <w:hyperlink w:anchor="_Toc197129231" w:history="1">
+          <w:hyperlink w:anchor="_Toc197129344" w:history="1">
             <w:r>
               <w:rPr>
                 <w:rStyle w:val="Hyperlink"/>
                 <w:noProof/>
               </w:rPr>
-              <w:t>Test Case output:</w:t>
+              <w:t>Implementation</w:t>
+            </w:r>
+            <w:r>
+              <w:rPr>
+                <w:rStyle w:val="Hyperlink"/>
+                <w:noProof/>
+                <w:rtl/>
+              </w:rPr>
+              <w:t xml:space="preserve"> </w:t>
+            </w:r>
+            <w:r>
+              <w:rPr>
+                <w:rStyle w:val="Hyperlink"/>
+                <w:noProof/>
+              </w:rPr>
+              <w:t>with a test case:</w:t>
             </w:r>
             <w:r>
               <w:rPr>
@@ -2376,7 +2817,7 @@
                 <w:noProof/>
                 <w:webHidden/>
               </w:rPr>
-              <w:instrText xml:space="preserve"> PAGEREF _Toc197129231 \h </w:instrText>
+              <w:instrText xml:space="preserve"> PAGEREF _Toc197129344 \h </w:instrText>
             </w:r>
             <w:r>
               <w:rPr>
@@ -2396,78 +2837,7 @@
                 <w:noProof/>
                 <w:webHidden/>
               </w:rPr>
-              <w:t>11</w:t>
-            </w:r>
-            <w:r>
-              <w:rPr>
-                <w:noProof/>
-                <w:webHidden/>
-              </w:rPr>
-              <w:fldChar w:fldCharType="end"/>
-            </w:r>
-          </w:hyperlink>
-        </w:p>
-        <w:p>
-          <w:pPr>
-            <w:pStyle w:val="TOC1"/>
-            <w:tabs>
-              <w:tab w:val="right" w:leader="dot" w:pos="9350"/>
-            </w:tabs>
-            <w:rPr>
-              <w:rFonts w:eastAsiaTheme="minorEastAsia"/>
-              <w:noProof/>
-              <w:sz w:val="24"/>
-              <w:szCs w:val="24"/>
-            </w:rPr>
-          </w:pPr>
-          <w:hyperlink w:anchor="_Toc197129232" w:history="1">
-            <w:r>
-              <w:rPr>
-                <w:rStyle w:val="Hyperlink"/>
-                <w:noProof/>
-              </w:rPr>
-              <w:t>Linear Congruential Generator</w:t>
-            </w:r>
-            <w:r>
-              <w:rPr>
-                <w:noProof/>
-                <w:webHidden/>
-              </w:rPr>
-              <w:tab/>
-            </w:r>
-            <w:r>
-              <w:rPr>
-                <w:noProof/>
-                <w:webHidden/>
-              </w:rPr>
-              <w:fldChar w:fldCharType="begin"/>
-            </w:r>
-            <w:r>
-              <w:rPr>
-                <w:noProof/>
-                <w:webHidden/>
-              </w:rPr>
-              <w:instrText xml:space="preserve"> PAGEREF _Toc197129232 \h </w:instrText>
-            </w:r>
-            <w:r>
-              <w:rPr>
-                <w:noProof/>
-                <w:webHidden/>
-              </w:rPr>
-            </w:r>
-            <w:r>
-              <w:rPr>
-                <w:noProof/>
-                <w:webHidden/>
-              </w:rPr>
-              <w:fldChar w:fldCharType="separate"/>
-            </w:r>
-            <w:r>
-              <w:rPr>
-                <w:noProof/>
-                <w:webHidden/>
-              </w:rPr>
-              <w:t>11</w:t>
+              <w:t>12</w:t>
             </w:r>
             <w:r>
               <w:rPr>
@@ -2491,13 +2861,13 @@
               <w:szCs w:val="24"/>
             </w:rPr>
           </w:pPr>
-          <w:hyperlink w:anchor="_Toc197129233" w:history="1">
+          <w:hyperlink w:anchor="_Toc197129345" w:history="1">
             <w:r>
               <w:rPr>
                 <w:rStyle w:val="Hyperlink"/>
                 <w:noProof/>
               </w:rPr>
-              <w:t>Purpose</w:t>
+              <w:t>Test Case output:</w:t>
             </w:r>
             <w:r>
               <w:rPr>
@@ -2518,377 +2888,7 @@
                 <w:noProof/>
                 <w:webHidden/>
               </w:rPr>
-              <w:instrText xml:space="preserve"> PAGEREF _Toc197129233 \h </w:instrText>
-            </w:r>
-            <w:r>
-              <w:rPr>
-                <w:noProof/>
-                <w:webHidden/>
-              </w:rPr>
-            </w:r>
-            <w:r>
-              <w:rPr>
-                <w:noProof/>
-                <w:webHidden/>
-              </w:rPr>
-              <w:fldChar w:fldCharType="separate"/>
-            </w:r>
-            <w:r>
-              <w:rPr>
-                <w:noProof/>
-                <w:webHidden/>
-              </w:rPr>
-              <w:t>11</w:t>
-            </w:r>
-            <w:r>
-              <w:rPr>
-                <w:noProof/>
-                <w:webHidden/>
-              </w:rPr>
-              <w:fldChar w:fldCharType="end"/>
-            </w:r>
-          </w:hyperlink>
-        </w:p>
-        <w:p>
-          <w:pPr>
-            <w:pStyle w:val="TOC2"/>
-            <w:tabs>
-              <w:tab w:val="right" w:leader="dot" w:pos="9350"/>
-            </w:tabs>
-            <w:rPr>
-              <w:rFonts w:eastAsiaTheme="minorEastAsia"/>
-              <w:noProof/>
-              <w:sz w:val="24"/>
-              <w:szCs w:val="24"/>
-            </w:rPr>
-          </w:pPr>
-          <w:hyperlink w:anchor="_Toc197129234" w:history="1">
-            <w:r>
-              <w:rPr>
-                <w:rStyle w:val="Hyperlink"/>
-                <w:noProof/>
-              </w:rPr>
-              <w:t>Key Components :</w:t>
-            </w:r>
-            <w:r>
-              <w:rPr>
-                <w:noProof/>
-                <w:webHidden/>
-              </w:rPr>
-              <w:tab/>
-            </w:r>
-            <w:r>
-              <w:rPr>
-                <w:noProof/>
-                <w:webHidden/>
-              </w:rPr>
-              <w:fldChar w:fldCharType="begin"/>
-            </w:r>
-            <w:r>
-              <w:rPr>
-                <w:noProof/>
-                <w:webHidden/>
-              </w:rPr>
-              <w:instrText xml:space="preserve"> PAGEREF _Toc197129234 \h </w:instrText>
-            </w:r>
-            <w:r>
-              <w:rPr>
-                <w:noProof/>
-                <w:webHidden/>
-              </w:rPr>
-            </w:r>
-            <w:r>
-              <w:rPr>
-                <w:noProof/>
-                <w:webHidden/>
-              </w:rPr>
-              <w:fldChar w:fldCharType="separate"/>
-            </w:r>
-            <w:r>
-              <w:rPr>
-                <w:noProof/>
-                <w:webHidden/>
-              </w:rPr>
-              <w:t>11</w:t>
-            </w:r>
-            <w:r>
-              <w:rPr>
-                <w:noProof/>
-                <w:webHidden/>
-              </w:rPr>
-              <w:fldChar w:fldCharType="end"/>
-            </w:r>
-          </w:hyperlink>
-        </w:p>
-        <w:p>
-          <w:pPr>
-            <w:pStyle w:val="TOC2"/>
-            <w:tabs>
-              <w:tab w:val="right" w:leader="dot" w:pos="9350"/>
-            </w:tabs>
-            <w:rPr>
-              <w:rFonts w:eastAsiaTheme="minorEastAsia"/>
-              <w:noProof/>
-              <w:sz w:val="24"/>
-              <w:szCs w:val="24"/>
-            </w:rPr>
-          </w:pPr>
-          <w:hyperlink w:anchor="_Toc197129235" w:history="1">
-            <w:r>
-              <w:rPr>
-                <w:rStyle w:val="Hyperlink"/>
-                <w:noProof/>
-              </w:rPr>
-              <w:t>Algorithm Details :</w:t>
-            </w:r>
-            <w:r>
-              <w:rPr>
-                <w:noProof/>
-                <w:webHidden/>
-              </w:rPr>
-              <w:tab/>
-            </w:r>
-            <w:r>
-              <w:rPr>
-                <w:noProof/>
-                <w:webHidden/>
-              </w:rPr>
-              <w:fldChar w:fldCharType="begin"/>
-            </w:r>
-            <w:r>
-              <w:rPr>
-                <w:noProof/>
-                <w:webHidden/>
-              </w:rPr>
-              <w:instrText xml:space="preserve"> PAGEREF _Toc197129235 \h </w:instrText>
-            </w:r>
-            <w:r>
-              <w:rPr>
-                <w:noProof/>
-                <w:webHidden/>
-              </w:rPr>
-            </w:r>
-            <w:r>
-              <w:rPr>
-                <w:noProof/>
-                <w:webHidden/>
-              </w:rPr>
-              <w:fldChar w:fldCharType="separate"/>
-            </w:r>
-            <w:r>
-              <w:rPr>
-                <w:noProof/>
-                <w:webHidden/>
-              </w:rPr>
-              <w:t>11</w:t>
-            </w:r>
-            <w:r>
-              <w:rPr>
-                <w:noProof/>
-                <w:webHidden/>
-              </w:rPr>
-              <w:fldChar w:fldCharType="end"/>
-            </w:r>
-          </w:hyperlink>
-        </w:p>
-        <w:p>
-          <w:pPr>
-            <w:pStyle w:val="TOC2"/>
-            <w:tabs>
-              <w:tab w:val="right" w:leader="dot" w:pos="9350"/>
-            </w:tabs>
-            <w:rPr>
-              <w:rFonts w:eastAsiaTheme="minorEastAsia"/>
-              <w:noProof/>
-              <w:sz w:val="24"/>
-              <w:szCs w:val="24"/>
-            </w:rPr>
-          </w:pPr>
-          <w:hyperlink w:anchor="_Toc197129236" w:history="1">
-            <w:r>
-              <w:rPr>
-                <w:rStyle w:val="Hyperlink"/>
-                <w:noProof/>
-              </w:rPr>
-              <w:t>Design Choices:</w:t>
-            </w:r>
-            <w:r>
-              <w:rPr>
-                <w:noProof/>
-                <w:webHidden/>
-              </w:rPr>
-              <w:tab/>
-            </w:r>
-            <w:r>
-              <w:rPr>
-                <w:noProof/>
-                <w:webHidden/>
-              </w:rPr>
-              <w:fldChar w:fldCharType="begin"/>
-            </w:r>
-            <w:r>
-              <w:rPr>
-                <w:noProof/>
-                <w:webHidden/>
-              </w:rPr>
-              <w:instrText xml:space="preserve"> PAGEREF _Toc197129236 \h </w:instrText>
-            </w:r>
-            <w:r>
-              <w:rPr>
-                <w:noProof/>
-                <w:webHidden/>
-              </w:rPr>
-            </w:r>
-            <w:r>
-              <w:rPr>
-                <w:noProof/>
-                <w:webHidden/>
-              </w:rPr>
-              <w:fldChar w:fldCharType="separate"/>
-            </w:r>
-            <w:r>
-              <w:rPr>
-                <w:noProof/>
-                <w:webHidden/>
-              </w:rPr>
-              <w:t>11</w:t>
-            </w:r>
-            <w:r>
-              <w:rPr>
-                <w:noProof/>
-                <w:webHidden/>
-              </w:rPr>
-              <w:fldChar w:fldCharType="end"/>
-            </w:r>
-          </w:hyperlink>
-        </w:p>
-        <w:p>
-          <w:pPr>
-            <w:pStyle w:val="TOC2"/>
-            <w:tabs>
-              <w:tab w:val="right" w:leader="dot" w:pos="9350"/>
-            </w:tabs>
-            <w:rPr>
-              <w:rFonts w:eastAsiaTheme="minorEastAsia"/>
-              <w:noProof/>
-              <w:sz w:val="24"/>
-              <w:szCs w:val="24"/>
-            </w:rPr>
-          </w:pPr>
-          <w:hyperlink w:anchor="_Toc197129237" w:history="1">
-            <w:r>
-              <w:rPr>
-                <w:rStyle w:val="Hyperlink"/>
-                <w:noProof/>
-              </w:rPr>
-              <w:t>Implementation</w:t>
-            </w:r>
-            <w:r>
-              <w:rPr>
-                <w:rStyle w:val="Hyperlink"/>
-                <w:noProof/>
-                <w:rtl/>
-              </w:rPr>
-              <w:t xml:space="preserve"> </w:t>
-            </w:r>
-            <w:r>
-              <w:rPr>
-                <w:rStyle w:val="Hyperlink"/>
-                <w:noProof/>
-              </w:rPr>
-              <w:t>with a test case:</w:t>
-            </w:r>
-            <w:r>
-              <w:rPr>
-                <w:noProof/>
-                <w:webHidden/>
-              </w:rPr>
-              <w:tab/>
-            </w:r>
-            <w:r>
-              <w:rPr>
-                <w:noProof/>
-                <w:webHidden/>
-              </w:rPr>
-              <w:fldChar w:fldCharType="begin"/>
-            </w:r>
-            <w:r>
-              <w:rPr>
-                <w:noProof/>
-                <w:webHidden/>
-              </w:rPr>
-              <w:instrText xml:space="preserve"> PAGEREF _Toc197129237 \h </w:instrText>
-            </w:r>
-            <w:r>
-              <w:rPr>
-                <w:noProof/>
-                <w:webHidden/>
-              </w:rPr>
-            </w:r>
-            <w:r>
-              <w:rPr>
-                <w:noProof/>
-                <w:webHidden/>
-              </w:rPr>
-              <w:fldChar w:fldCharType="separate"/>
-            </w:r>
-            <w:r>
-              <w:rPr>
-                <w:noProof/>
-                <w:webHidden/>
-              </w:rPr>
-              <w:t>12</w:t>
-            </w:r>
-            <w:r>
-              <w:rPr>
-                <w:noProof/>
-                <w:webHidden/>
-              </w:rPr>
-              <w:fldChar w:fldCharType="end"/>
-            </w:r>
-          </w:hyperlink>
-        </w:p>
-        <w:p>
-          <w:pPr>
-            <w:pStyle w:val="TOC2"/>
-            <w:tabs>
-              <w:tab w:val="right" w:leader="dot" w:pos="9350"/>
-            </w:tabs>
-            <w:rPr>
-              <w:rFonts w:eastAsiaTheme="minorEastAsia"/>
-              <w:noProof/>
-              <w:sz w:val="24"/>
-              <w:szCs w:val="24"/>
-            </w:rPr>
-          </w:pPr>
-          <w:hyperlink w:anchor="_Toc197129238" w:history="1">
-            <w:r>
-              <w:rPr>
-                <w:rStyle w:val="Hyperlink"/>
-                <w:noProof/>
-              </w:rPr>
-              <w:t>Test Case output:</w:t>
-            </w:r>
-            <w:r>
-              <w:rPr>
-                <w:noProof/>
-                <w:webHidden/>
-              </w:rPr>
-              <w:tab/>
-            </w:r>
-            <w:r>
-              <w:rPr>
-                <w:noProof/>
-                <w:webHidden/>
-              </w:rPr>
-              <w:fldChar w:fldCharType="begin"/>
-            </w:r>
-            <w:r>
-              <w:rPr>
-                <w:noProof/>
-                <w:webHidden/>
-              </w:rPr>
-              <w:instrText xml:space="preserve"> PAGEREF _Toc197129238 \h </w:instrText>
+              <w:instrText xml:space="preserve"> PAGEREF _Toc197129345 \h </w:instrText>
             </w:r>
             <w:r>
               <w:rPr>
@@ -2965,7 +2965,7 @@
       <w:pPr>
         <w:pStyle w:val="Heading1"/>
       </w:pPr>
-      <w:bookmarkStart w:id="1" w:name="_Toc197129209"/>
+      <w:bookmarkStart w:id="1" w:name="_Toc197129316"/>
       <w:r>
         <w:t>Communication Flow</w:t>
       </w:r>
@@ -2975,7 +2975,7 @@
       <w:pPr>
         <w:pStyle w:val="Heading2"/>
       </w:pPr>
-      <w:bookmarkStart w:id="2" w:name="_Toc197129210"/>
+      <w:bookmarkStart w:id="2" w:name="_Toc197129317"/>
       <w:r>
         <w:t>Client Side</w:t>
       </w:r>
@@ -3042,7 +3042,7 @@
       <w:pPr>
         <w:pStyle w:val="Heading2"/>
       </w:pPr>
-      <w:bookmarkStart w:id="3" w:name="_Toc197129211"/>
+      <w:bookmarkStart w:id="3" w:name="_Toc197129318"/>
       <w:r>
         <w:t>Server Side</w:t>
       </w:r>
@@ -3110,7 +3110,7 @@
       <w:pPr>
         <w:pStyle w:val="Heading2"/>
       </w:pPr>
-      <w:bookmarkStart w:id="4" w:name="_Toc197129212"/>
+      <w:bookmarkStart w:id="4" w:name="_Toc197129319"/>
       <w:r>
         <w:t>Code</w:t>
       </w:r>
@@ -3140,7 +3140,7 @@
       <w:pPr>
         <w:pStyle w:val="Heading2"/>
       </w:pPr>
-      <w:bookmarkStart w:id="5" w:name="_Toc197129213"/>
+      <w:bookmarkStart w:id="5" w:name="_Toc197129320"/>
       <w:r>
         <w:t>Test Case</w:t>
       </w:r>
@@ -3181,7 +3181,7 @@
       <w:pPr>
         <w:pStyle w:val="Heading1"/>
       </w:pPr>
-      <w:bookmarkStart w:id="6" w:name="_Toc197129214"/>
+      <w:bookmarkStart w:id="6" w:name="_Toc197129321"/>
       <w:proofErr w:type="spellStart"/>
       <w:r>
         <w:t>key_exchange</w:t>
@@ -3196,7 +3196,7 @@
           <w:szCs w:val="28"/>
         </w:rPr>
       </w:pPr>
-      <w:bookmarkStart w:id="7" w:name="_Toc197129215"/>
+      <w:bookmarkStart w:id="7" w:name="_Toc197129322"/>
       <w:proofErr w:type="gramStart"/>
       <w:r>
         <w:rPr>
@@ -3225,7 +3225,7 @@
       <w:pPr>
         <w:pStyle w:val="Heading2"/>
       </w:pPr>
-      <w:bookmarkStart w:id="8" w:name="_Toc197129216"/>
+      <w:bookmarkStart w:id="8" w:name="_Toc197129323"/>
       <w:r>
         <w:t>Algorithm Details</w:t>
       </w:r>
@@ -4496,7 +4496,7 @@
       <w:pPr>
         <w:pStyle w:val="Heading2"/>
       </w:pPr>
-      <w:bookmarkStart w:id="9" w:name="_Toc197129217"/>
+      <w:bookmarkStart w:id="9" w:name="_Toc197129324"/>
       <w:r>
         <w:t>Design Choices</w:t>
       </w:r>
@@ -4536,7 +4536,7 @@
       <w:pPr>
         <w:pStyle w:val="Heading2"/>
       </w:pPr>
-      <w:bookmarkStart w:id="10" w:name="_Toc197129218"/>
+      <w:bookmarkStart w:id="10" w:name="_Toc197129325"/>
       <w:r>
         <w:t>Implementation with a test case</w:t>
       </w:r>
@@ -4608,7 +4608,7 @@
       <w:pPr>
         <w:pStyle w:val="Heading2"/>
       </w:pPr>
-      <w:bookmarkStart w:id="11" w:name="_Toc197129219"/>
+      <w:bookmarkStart w:id="11" w:name="_Toc197129326"/>
       <w:r>
         <w:lastRenderedPageBreak/>
         <w:t>Test Case output</w:t>
@@ -4667,65 +4667,65 @@
     </w:p>
     <w:p>
       <w:pPr>
+        <w:pStyle w:val="Heading1"/>
+      </w:pPr>
+      <w:bookmarkStart w:id="12" w:name="_Toc197129327"/>
+      <w:r>
+        <w:t>Seed Encryption – AES-CBC</w:t>
+      </w:r>
+      <w:bookmarkEnd w:id="12"/>
+    </w:p>
+    <w:p>
+      <w:pPr>
+        <w:rPr>
+          <w:sz w:val="28"/>
+          <w:szCs w:val="28"/>
+        </w:rPr>
+      </w:pPr>
+      <w:bookmarkStart w:id="13" w:name="_Toc197129328"/>
+      <w:proofErr w:type="gramStart"/>
+      <w:r>
+        <w:rPr>
+          <w:rStyle w:val="Heading2Char"/>
+        </w:rPr>
+        <w:t>Purpose</w:t>
+      </w:r>
+      <w:bookmarkEnd w:id="13"/>
+      <w:r>
+        <w:rPr>
+          <w:sz w:val="28"/>
+          <w:szCs w:val="28"/>
+        </w:rPr>
+        <w:t xml:space="preserve"> :</w:t>
+      </w:r>
+      <w:proofErr w:type="gramEnd"/>
+      <w:r>
+        <w:rPr>
+          <w:sz w:val="28"/>
+          <w:szCs w:val="28"/>
+        </w:rPr>
+        <w:t xml:space="preserve"> Encrypts the seed used by the stream cipher to ensure it remains confidential during </w:t>
+      </w:r>
+      <w:r>
+        <w:rPr>
+          <w:sz w:val="28"/>
+          <w:szCs w:val="28"/>
+        </w:rPr>
+        <w:t>transmission</w:t>
+      </w:r>
+      <w:r>
+        <w:rPr>
+          <w:sz w:val="28"/>
+          <w:szCs w:val="28"/>
+        </w:rPr>
+        <w:t>.</w:t>
+      </w:r>
+    </w:p>
+    <w:p>
+      <w:pPr>
         <w:pStyle w:val="Heading2"/>
       </w:pPr>
-      <w:bookmarkStart w:id="12" w:name="_Toc197129220"/>
-      <w:r>
-        <w:t>Seed Encryption – AES-CBC</w:t>
-      </w:r>
-      <w:bookmarkEnd w:id="12"/>
-    </w:p>
-    <w:p>
-      <w:pPr>
-        <w:rPr>
-          <w:sz w:val="28"/>
-          <w:szCs w:val="28"/>
-        </w:rPr>
-      </w:pPr>
-      <w:bookmarkStart w:id="13" w:name="_Toc197129221"/>
-      <w:proofErr w:type="gramStart"/>
-      <w:r>
-        <w:rPr>
-          <w:rStyle w:val="Heading2Char"/>
-        </w:rPr>
-        <w:t>Purpose</w:t>
-      </w:r>
-      <w:bookmarkEnd w:id="13"/>
-      <w:r>
-        <w:rPr>
-          <w:sz w:val="28"/>
-          <w:szCs w:val="28"/>
-        </w:rPr>
-        <w:t xml:space="preserve"> :</w:t>
-      </w:r>
-      <w:proofErr w:type="gramEnd"/>
-      <w:r>
-        <w:rPr>
-          <w:sz w:val="28"/>
-          <w:szCs w:val="28"/>
-        </w:rPr>
-        <w:t xml:space="preserve"> Encrypts the seed used by the stream cipher to ensure it remains confidential during </w:t>
-      </w:r>
-      <w:r>
-        <w:rPr>
-          <w:sz w:val="28"/>
-          <w:szCs w:val="28"/>
-        </w:rPr>
-        <w:t>transmission</w:t>
-      </w:r>
-      <w:r>
-        <w:rPr>
-          <w:sz w:val="28"/>
-          <w:szCs w:val="28"/>
-        </w:rPr>
-        <w:t>.</w:t>
-      </w:r>
-    </w:p>
-    <w:p>
-      <w:pPr>
-        <w:pStyle w:val="Heading2"/>
-      </w:pPr>
-      <w:bookmarkStart w:id="14" w:name="_Toc197129222"/>
+      <w:bookmarkStart w:id="14" w:name="_Toc197129329"/>
       <w:r>
         <w:rPr>
           <w:rFonts w:eastAsiaTheme="minorHAnsi"/>
@@ -4846,7 +4846,7 @@
       <w:pPr>
         <w:pStyle w:val="Heading2"/>
       </w:pPr>
-      <w:bookmarkStart w:id="15" w:name="_Toc197129223"/>
+      <w:bookmarkStart w:id="15" w:name="_Toc197129330"/>
       <w:r>
         <w:t xml:space="preserve">Algorithm </w:t>
       </w:r>
@@ -5055,7 +5055,7 @@
       <w:pPr>
         <w:pStyle w:val="Heading2"/>
       </w:pPr>
-      <w:bookmarkStart w:id="16" w:name="_Toc197129224"/>
+      <w:bookmarkStart w:id="16" w:name="_Toc197129331"/>
       <w:r>
         <w:lastRenderedPageBreak/>
         <w:t>Implementation</w:t>
@@ -5155,7 +5155,7 @@
       <w:pPr>
         <w:pStyle w:val="Heading2"/>
       </w:pPr>
-      <w:bookmarkStart w:id="17" w:name="_Toc197129225"/>
+      <w:bookmarkStart w:id="17" w:name="_Toc197129332"/>
       <w:r>
         <w:t>Test Case</w:t>
       </w:r>
@@ -5221,7 +5221,7 @@
       <w:pPr>
         <w:pStyle w:val="Heading1"/>
       </w:pPr>
-      <w:bookmarkStart w:id="18" w:name="_Toc197129226"/>
+      <w:bookmarkStart w:id="18" w:name="_Toc197129333"/>
       <w:r>
         <w:t>Seed Authentication</w:t>
       </w:r>
@@ -5234,7 +5234,7 @@
           <w:szCs w:val="28"/>
         </w:rPr>
       </w:pPr>
-      <w:bookmarkStart w:id="19" w:name="_Toc197129227"/>
+      <w:bookmarkStart w:id="19" w:name="_Toc197129334"/>
       <w:proofErr w:type="gramStart"/>
       <w:r>
         <w:rPr>
@@ -5263,7 +5263,7 @@
       <w:pPr>
         <w:pStyle w:val="Heading2"/>
       </w:pPr>
-      <w:bookmarkStart w:id="20" w:name="_Toc197129228"/>
+      <w:bookmarkStart w:id="20" w:name="_Toc197129335"/>
       <w:r>
         <w:t xml:space="preserve">Key </w:t>
       </w:r>
@@ -5379,7 +5379,7 @@
       <w:pPr>
         <w:pStyle w:val="Heading2"/>
       </w:pPr>
-      <w:bookmarkStart w:id="21" w:name="_Toc197129229"/>
+      <w:bookmarkStart w:id="21" w:name="_Toc197129336"/>
       <w:r>
         <w:t xml:space="preserve">Algorithm </w:t>
       </w:r>
@@ -5565,7 +5565,7 @@
       <w:pPr>
         <w:pStyle w:val="Heading2"/>
       </w:pPr>
-      <w:bookmarkStart w:id="22" w:name="_Toc197129230"/>
+      <w:bookmarkStart w:id="22" w:name="_Toc197129337"/>
       <w:r>
         <w:lastRenderedPageBreak/>
         <w:t>Implementation</w:t>
@@ -5662,7 +5662,7 @@
       <w:pPr>
         <w:pStyle w:val="Heading2"/>
       </w:pPr>
-      <w:bookmarkStart w:id="23" w:name="_Toc197129231"/>
+      <w:bookmarkStart w:id="23" w:name="_Toc197129338"/>
       <w:r>
         <w:lastRenderedPageBreak/>
         <w:t>Test Case</w:t>
@@ -5718,7 +5718,7 @@
       <w:pPr>
         <w:pStyle w:val="Heading1"/>
       </w:pPr>
-      <w:bookmarkStart w:id="24" w:name="_Toc197129232"/>
+      <w:bookmarkStart w:id="24" w:name="_Toc197129339"/>
       <w:r>
         <w:t>Linear Congruential Generator</w:t>
       </w:r>
@@ -5731,7 +5731,7 @@
           <w:szCs w:val="28"/>
         </w:rPr>
       </w:pPr>
-      <w:bookmarkStart w:id="25" w:name="_Toc197129233"/>
+      <w:bookmarkStart w:id="25" w:name="_Toc197129340"/>
       <w:proofErr w:type="gramStart"/>
       <w:r>
         <w:rPr>
@@ -5760,7 +5760,7 @@
       <w:pPr>
         <w:pStyle w:val="Heading2"/>
       </w:pPr>
-      <w:bookmarkStart w:id="26" w:name="_Toc197129234"/>
+      <w:bookmarkStart w:id="26" w:name="_Toc197129341"/>
       <w:r>
         <w:t xml:space="preserve">Key </w:t>
       </w:r>
@@ -5904,7 +5904,7 @@
       <w:pPr>
         <w:pStyle w:val="Heading2"/>
       </w:pPr>
-      <w:bookmarkStart w:id="27" w:name="_Toc197129235"/>
+      <w:bookmarkStart w:id="27" w:name="_Toc197129342"/>
       <w:r>
         <w:t xml:space="preserve">Algorithm </w:t>
       </w:r>
@@ -6104,7 +6104,7 @@
       <w:pPr>
         <w:pStyle w:val="Heading2"/>
       </w:pPr>
-      <w:bookmarkStart w:id="28" w:name="_Toc197129236"/>
+      <w:bookmarkStart w:id="28" w:name="_Toc197129343"/>
       <w:r>
         <w:t>Design Choices:</w:t>
       </w:r>
@@ -6212,7 +6212,7 @@
       <w:pPr>
         <w:pStyle w:val="Heading2"/>
       </w:pPr>
-      <w:bookmarkStart w:id="29" w:name="_Toc197129237"/>
+      <w:bookmarkStart w:id="29" w:name="_Toc197129344"/>
       <w:r>
         <w:lastRenderedPageBreak/>
         <w:t>Implementation</w:t>
@@ -6297,7 +6297,7 @@
       <w:pPr>
         <w:pStyle w:val="Heading2"/>
       </w:pPr>
-      <w:bookmarkStart w:id="30" w:name="_Toc197129238"/>
+      <w:bookmarkStart w:id="30" w:name="_Toc197129345"/>
       <w:r>
         <w:t>Test Case</w:t>
       </w:r>

</xml_diff>